<commit_message>
Updated app.py with new functionality
</commit_message>
<xml_diff>
--- a/CICD Pipeline with Docker GitHub Actions Docker Hub and Kubernetes.docx
+++ b/CICD Pipeline with Docker GitHub Actions Docker Hub and Kubernetes.docx
@@ -413,6 +413,7 @@
           <w:bCs/>
         </w:rPr>
       </w:pPr>
+      <w:proofErr w:type="spellStart"/>
       <w:r>
         <w:rPr>
           <w:b/>
@@ -420,6 +421,7 @@
         </w:rPr>
         <w:t>kubectl</w:t>
       </w:r>
+      <w:proofErr w:type="spellEnd"/>
     </w:p>
     <w:p>
       <w:hyperlink r:id="rId6" w:tgtFrame="_blank" w:history="1">
@@ -427,7 +429,21 @@
           <w:rPr>
             <w:rStyle w:val="Hyperlink"/>
           </w:rPr>
-          <w:t>Kubernetes kubectl Documentation</w:t>
+          <w:t xml:space="preserve">Kubernetes </w:t>
+        </w:r>
+        <w:proofErr w:type="spellStart"/>
+        <w:r>
+          <w:rPr>
+            <w:rStyle w:val="Hyperlink"/>
+          </w:rPr>
+          <w:t>kubectl</w:t>
+        </w:r>
+        <w:proofErr w:type="spellEnd"/>
+        <w:r>
+          <w:rPr>
+            <w:rStyle w:val="Hyperlink"/>
+          </w:rPr>
+          <w:t xml:space="preserve"> Documentation</w:t>
         </w:r>
       </w:hyperlink>
     </w:p>
@@ -437,8 +453,13 @@
       </w:r>
     </w:p>
     <w:p>
-      <w:r>
-        <w:t>kubectl version --client</w:t>
+      <w:proofErr w:type="spellStart"/>
+      <w:r>
+        <w:t>kubectl</w:t>
+      </w:r>
+      <w:proofErr w:type="spellEnd"/>
+      <w:r>
+        <w:t xml:space="preserve"> version --client</w:t>
       </w:r>
     </w:p>
     <w:p>
@@ -548,8 +569,13 @@
       </w:r>
     </w:p>
     <w:p>
-      <w:r>
-        <w:t>mkdir ci-cd-project</w:t>
+      <w:proofErr w:type="spellStart"/>
+      <w:r>
+        <w:t>mkdir</w:t>
+      </w:r>
+      <w:proofErr w:type="spellEnd"/>
+      <w:r>
+        <w:t xml:space="preserve"> ci-cd-project</w:t>
       </w:r>
       <w:r>
         <w:br/>
@@ -644,8 +670,13 @@
         <w:t>──</w:t>
       </w:r>
       <w:r>
-        <w:t xml:space="preserve"> Dockerfile</w:t>
-      </w:r>
+        <w:t xml:space="preserve"> </w:t>
+      </w:r>
+      <w:proofErr w:type="spellStart"/>
+      <w:r>
+        <w:t>Dockerfile</w:t>
+      </w:r>
+      <w:proofErr w:type="spellEnd"/>
       <w:r>
         <w:br/>
       </w:r>
@@ -662,8 +693,15 @@
         <w:t>──</w:t>
       </w:r>
       <w:r>
-        <w:t xml:space="preserve"> deployment.yaml</w:t>
-      </w:r>
+        <w:t xml:space="preserve"> </w:t>
+      </w:r>
+      <w:proofErr w:type="spellStart"/>
+      <w:proofErr w:type="gramStart"/>
+      <w:r>
+        <w:t>deployment.yaml</w:t>
+      </w:r>
+      <w:proofErr w:type="spellEnd"/>
+      <w:proofErr w:type="gramEnd"/>
       <w:r>
         <w:br/>
       </w:r>
@@ -680,8 +718,15 @@
         <w:t>──</w:t>
       </w:r>
       <w:r>
-        <w:t xml:space="preserve"> service.yaml</w:t>
-      </w:r>
+        <w:t xml:space="preserve"> </w:t>
+      </w:r>
+      <w:proofErr w:type="spellStart"/>
+      <w:proofErr w:type="gramStart"/>
+      <w:r>
+        <w:t>service.yaml</w:t>
+      </w:r>
+      <w:proofErr w:type="spellEnd"/>
+      <w:proofErr w:type="gramEnd"/>
       <w:r>
         <w:br/>
       </w:r>
@@ -689,14 +734,40 @@
         <w:rPr>
           <w:rFonts w:ascii="Calibri" w:hAnsi="Calibri" w:cs="Calibri"/>
         </w:rPr>
+        <w:t>└─</w:t>
+      </w:r>
+      <w:proofErr w:type="gramStart"/>
+      <w:r>
+        <w:rPr>
+          <w:rFonts w:ascii="Calibri" w:hAnsi="Calibri" w:cs="Calibri"/>
+        </w:rPr>
+        <w:t>─</w:t>
+      </w:r>
+      <w:r>
+        <w:t xml:space="preserve"> .</w:t>
+      </w:r>
+      <w:proofErr w:type="spellStart"/>
+      <w:r>
+        <w:t>github</w:t>
+      </w:r>
+      <w:proofErr w:type="spellEnd"/>
+      <w:proofErr w:type="gramEnd"/>
+      <w:r>
+        <w:br/>
+        <w:t xml:space="preserve">    </w:t>
+      </w:r>
+      <w:r>
+        <w:rPr>
+          <w:rFonts w:ascii="Calibri" w:hAnsi="Calibri" w:cs="Calibri"/>
+        </w:rPr>
         <w:t>└──</w:t>
       </w:r>
       <w:r>
-        <w:t xml:space="preserve"> .github</w:t>
-      </w:r>
-      <w:r>
-        <w:br/>
-        <w:t xml:space="preserve">    </w:t>
+        <w:t xml:space="preserve"> workflows</w:t>
+      </w:r>
+      <w:r>
+        <w:br/>
+        <w:t xml:space="preserve">        </w:t>
       </w:r>
       <w:r>
         <w:rPr>
@@ -705,21 +776,13 @@
         <w:t>└──</w:t>
       </w:r>
       <w:r>
-        <w:t xml:space="preserve"> workflows</w:t>
-      </w:r>
-      <w:r>
-        <w:br/>
-        <w:t xml:space="preserve">        </w:t>
-      </w:r>
-      <w:r>
-        <w:rPr>
-          <w:rFonts w:ascii="Calibri" w:hAnsi="Calibri" w:cs="Calibri"/>
-        </w:rPr>
-        <w:t>└──</w:t>
-      </w:r>
-      <w:r>
-        <w:t xml:space="preserve"> pipeline.yml</w:t>
-      </w:r>
+        <w:t xml:space="preserve"> </w:t>
+      </w:r>
+      <w:proofErr w:type="spellStart"/>
+      <w:r>
+        <w:t>pipeline.yml</w:t>
+      </w:r>
+      <w:proofErr w:type="spellEnd"/>
     </w:p>
     <w:p>
       <w:r>
@@ -764,11 +827,27 @@
       </w:r>
       <w:r>
         <w:br/>
-        <w:t>@app.route('/')</w:t>
-      </w:r>
-      <w:r>
-        <w:br/>
-        <w:t>def home():</w:t>
+        <w:t>@</w:t>
+      </w:r>
+      <w:proofErr w:type="gramStart"/>
+      <w:r>
+        <w:t>app.route</w:t>
+      </w:r>
+      <w:proofErr w:type="gramEnd"/>
+      <w:r>
+        <w:t>('/')</w:t>
+      </w:r>
+      <w:r>
+        <w:br/>
+        <w:t xml:space="preserve">def </w:t>
+      </w:r>
+      <w:proofErr w:type="gramStart"/>
+      <w:r>
+        <w:t>home(</w:t>
+      </w:r>
+      <w:proofErr w:type="gramEnd"/>
+      <w:r>
+        <w:t>):</w:t>
       </w:r>
       <w:r>
         <w:br/>
@@ -783,7 +862,20 @@
       </w:r>
       <w:r>
         <w:br/>
-        <w:t xml:space="preserve">    app.run(host="0.0.0.0", port=5000)</w:t>
+        <w:t xml:space="preserve">    </w:t>
+      </w:r>
+      <w:proofErr w:type="spellStart"/>
+      <w:proofErr w:type="gramStart"/>
+      <w:r>
+        <w:t>app.run</w:t>
+      </w:r>
+      <w:proofErr w:type="spellEnd"/>
+      <w:r>
+        <w:t>(</w:t>
+      </w:r>
+      <w:proofErr w:type="gramEnd"/>
+      <w:r>
+        <w:t>host="0.0.0.0", port=5000)</w:t>
       </w:r>
     </w:p>
     <w:p>
@@ -837,8 +929,17 @@
           <w:b/>
           <w:bCs/>
         </w:rPr>
-        <w:t>Step 5 Dockerfile</w:t>
-      </w:r>
+        <w:t xml:space="preserve">Step 5 </w:t>
+      </w:r>
+      <w:proofErr w:type="spellStart"/>
+      <w:r>
+        <w:rPr>
+          <w:b/>
+          <w:bCs/>
+        </w:rPr>
+        <w:t>Dockerfile</w:t>
+      </w:r>
+      <w:proofErr w:type="spellEnd"/>
     </w:p>
     <w:p>
       <w:r>
@@ -856,8 +957,13 @@
       </w:r>
       <w:r>
         <w:br/>
-        <w:t>COPY requirements.txt .</w:t>
-      </w:r>
+        <w:t xml:space="preserve">COPY </w:t>
+      </w:r>
+      <w:proofErr w:type="gramStart"/>
+      <w:r>
+        <w:t>requirements.txt .</w:t>
+      </w:r>
+      <w:proofErr w:type="gramEnd"/>
       <w:r>
         <w:br/>
       </w:r>
@@ -870,7 +976,14 @@
       </w:r>
       <w:r>
         <w:br/>
-        <w:t>COPY . .</w:t>
+      </w:r>
+      <w:proofErr w:type="gramStart"/>
+      <w:r>
+        <w:t>COPY .</w:t>
+      </w:r>
+      <w:proofErr w:type="gramEnd"/>
+      <w:r>
+        <w:t xml:space="preserve"> .</w:t>
       </w:r>
       <w:r>
         <w:br/>
@@ -884,7 +997,15 @@
       </w:r>
       <w:r>
         <w:br/>
-        <w:t>CMD ["python","app.py"]</w:t>
+        <w:t>CMD ["</w:t>
+      </w:r>
+      <w:proofErr w:type="spellStart"/>
+      <w:r>
+        <w:t>python","app.py</w:t>
+      </w:r>
+      <w:proofErr w:type="spellEnd"/>
+      <w:r>
+        <w:t>"]</w:t>
       </w:r>
     </w:p>
     <w:p>
@@ -917,8 +1038,13 @@
     </w:p>
     <w:p>
       <w:r>
-        <w:t>docker build -t flask-app:v1 .</w:t>
-      </w:r>
+        <w:t>docker build -t flask-</w:t>
+      </w:r>
+      <w:proofErr w:type="gramStart"/>
+      <w:r>
+        <w:t>app:v1 .</w:t>
+      </w:r>
+      <w:proofErr w:type="gramEnd"/>
     </w:p>
     <w:p>
       <w:r>
@@ -927,7 +1053,15 @@
     </w:p>
     <w:p>
       <w:r>
-        <w:t>docker run -p 5000:5000 flask-app:v1</w:t>
+        <w:t>docker run -p 5000:5000 flask-</w:t>
+      </w:r>
+      <w:proofErr w:type="gramStart"/>
+      <w:r>
+        <w:t>app:v</w:t>
+      </w:r>
+      <w:proofErr w:type="gramEnd"/>
+      <w:r>
+        <w:t>1</w:t>
       </w:r>
     </w:p>
     <w:p>
@@ -994,8 +1128,13 @@
     </w:p>
     <w:p>
       <w:r>
-        <w:t>flask-cicd</w:t>
-      </w:r>
+        <w:t>flask-</w:t>
+      </w:r>
+      <w:proofErr w:type="spellStart"/>
+      <w:r>
+        <w:t>cicd</w:t>
+      </w:r>
+      <w:proofErr w:type="spellEnd"/>
     </w:p>
     <w:p>
       <w:r>
@@ -1003,14 +1142,29 @@
       </w:r>
     </w:p>
     <w:p>
-      <w:r>
-        <w:t>yourdockerhubusername/flask-cicd</w:t>
-      </w:r>
-    </w:p>
-    <w:p>
-      <w:r>
-        <w:t>rajsingh9479/flask-cicd</w:t>
-      </w:r>
+      <w:proofErr w:type="spellStart"/>
+      <w:r>
+        <w:t>yourdockerhubusername</w:t>
+      </w:r>
+      <w:proofErr w:type="spellEnd"/>
+      <w:r>
+        <w:t>/flask-</w:t>
+      </w:r>
+      <w:proofErr w:type="spellStart"/>
+      <w:r>
+        <w:t>cicd</w:t>
+      </w:r>
+      <w:proofErr w:type="spellEnd"/>
+    </w:p>
+    <w:p>
+      <w:r>
+        <w:t>rajsingh9479/flask-</w:t>
+      </w:r>
+      <w:proofErr w:type="spellStart"/>
+      <w:r>
+        <w:t>cicd</w:t>
+      </w:r>
+      <w:proofErr w:type="spellEnd"/>
     </w:p>
     <w:p/>
     <w:p>
@@ -1052,21 +1206,61 @@
     </w:p>
     <w:p>
       <w:r>
-        <w:t>docker tag flask-app:v1 yourdockerhubusername/flask-cicd:v1</w:t>
-      </w:r>
-    </w:p>
-    <w:p>
-      <w:r>
-        <w:t>docker tag flask-app:v1</w:t>
+        <w:t>docker tag flask-</w:t>
+      </w:r>
+      <w:proofErr w:type="gramStart"/>
+      <w:r>
+        <w:t>app:v</w:t>
+      </w:r>
+      <w:proofErr w:type="gramEnd"/>
+      <w:r>
+        <w:t xml:space="preserve">1 </w:t>
+      </w:r>
+      <w:proofErr w:type="spellStart"/>
+      <w:r>
+        <w:t>yourdockerhubusername</w:t>
+      </w:r>
+      <w:proofErr w:type="spellEnd"/>
+      <w:r>
+        <w:t>/flask-</w:t>
+      </w:r>
+      <w:proofErr w:type="gramStart"/>
+      <w:r>
+        <w:t>cicd:v</w:t>
+      </w:r>
+      <w:proofErr w:type="gramEnd"/>
+      <w:r>
+        <w:t>1</w:t>
+      </w:r>
+    </w:p>
+    <w:p>
+      <w:r>
+        <w:t>docker tag flask-</w:t>
+      </w:r>
+      <w:proofErr w:type="gramStart"/>
+      <w:r>
+        <w:t>app:v</w:t>
+      </w:r>
+      <w:proofErr w:type="gramEnd"/>
+      <w:r>
+        <w:t>1</w:t>
       </w:r>
       <w:r>
         <w:t xml:space="preserve"> </w:t>
       </w:r>
       <w:r>
-        <w:t>rajsingh9479/flask-cicd</w:t>
-      </w:r>
-      <w:r>
-        <w:t>:v1</w:t>
+        <w:t>rajsingh9479/flask-</w:t>
+      </w:r>
+      <w:proofErr w:type="gramStart"/>
+      <w:r>
+        <w:t>cicd</w:t>
+      </w:r>
+      <w:r>
+        <w:t>:v</w:t>
+      </w:r>
+      <w:proofErr w:type="gramEnd"/>
+      <w:r>
+        <w:t>1</w:t>
       </w:r>
     </w:p>
     <w:p/>
@@ -1083,7 +1277,15 @@
         <w:t>rajsingh9479</w:t>
       </w:r>
       <w:r>
-        <w:t>/flask-cicd:v1</w:t>
+        <w:t>/flask-</w:t>
+      </w:r>
+      <w:proofErr w:type="gramStart"/>
+      <w:r>
+        <w:t>cicd:v</w:t>
+      </w:r>
+      <w:proofErr w:type="gramEnd"/>
+      <w:r>
+        <w:t>1</w:t>
       </w:r>
     </w:p>
     <w:p>
@@ -1110,7 +1312,15 @@
     </w:p>
     <w:p>
       <w:r>
-        <w:t>kind create cluster --name cicd-cluster</w:t>
+        <w:t xml:space="preserve">kind create cluster --name </w:t>
+      </w:r>
+      <w:proofErr w:type="spellStart"/>
+      <w:r>
+        <w:t>cicd</w:t>
+      </w:r>
+      <w:proofErr w:type="spellEnd"/>
+      <w:r>
+        <w:t>-cluster</w:t>
       </w:r>
     </w:p>
     <w:p>
@@ -1119,9 +1329,14 @@
       </w:r>
     </w:p>
     <w:p>
+      <w:proofErr w:type="spellStart"/>
       <w:r>
         <w:lastRenderedPageBreak/>
-        <w:t>kubectl get nodes</w:t>
+        <w:t>kubectl</w:t>
+      </w:r>
+      <w:proofErr w:type="spellEnd"/>
+      <w:r>
+        <w:t xml:space="preserve"> get nodes</w:t>
       </w:r>
     </w:p>
     <w:p>
@@ -1157,13 +1372,22 @@
       </w:r>
     </w:p>
     <w:p>
+      <w:proofErr w:type="spellStart"/>
+      <w:proofErr w:type="gramStart"/>
       <w:r>
         <w:t>deployment.yaml</w:t>
       </w:r>
-    </w:p>
-    <w:p>
-      <w:r>
-        <w:t>apiVersion: apps/v1</w:t>
+      <w:proofErr w:type="spellEnd"/>
+      <w:proofErr w:type="gramEnd"/>
+    </w:p>
+    <w:p>
+      <w:proofErr w:type="spellStart"/>
+      <w:r>
+        <w:t>apiVersion</w:t>
+      </w:r>
+      <w:proofErr w:type="spellEnd"/>
+      <w:r>
+        <w:t>: apps/v1</w:t>
       </w:r>
       <w:r>
         <w:br/>
@@ -1200,7 +1424,15 @@
       </w:r>
       <w:r>
         <w:br/>
-        <w:t xml:space="preserve">    matchLabels:</w:t>
+        <w:t xml:space="preserve">    </w:t>
+      </w:r>
+      <w:proofErr w:type="spellStart"/>
+      <w:r>
+        <w:t>matchLabels</w:t>
+      </w:r>
+      <w:proofErr w:type="spellEnd"/>
+      <w:r>
+        <w:t>:</w:t>
       </w:r>
       <w:r>
         <w:br/>
@@ -1245,8 +1477,26 @@
       </w:r>
       <w:r>
         <w:br/>
-        <w:t xml:space="preserve">        image: yourdockerhubusername/flask-cicd:latest</w:t>
-      </w:r>
+        <w:t xml:space="preserve">        image: </w:t>
+      </w:r>
+      <w:proofErr w:type="spellStart"/>
+      <w:r>
+        <w:t>yourdockerhubusername</w:t>
+      </w:r>
+      <w:proofErr w:type="spellEnd"/>
+      <w:r>
+        <w:t>/</w:t>
+      </w:r>
+      <w:proofErr w:type="spellStart"/>
+      <w:r>
+        <w:t>flask-</w:t>
+      </w:r>
+      <w:proofErr w:type="gramStart"/>
+      <w:r>
+        <w:t>cicd:latest</w:t>
+      </w:r>
+      <w:proofErr w:type="spellEnd"/>
+      <w:proofErr w:type="gramEnd"/>
       <w:r>
         <w:br/>
       </w:r>
@@ -1256,7 +1506,15 @@
       </w:r>
       <w:r>
         <w:br/>
-        <w:t xml:space="preserve">        - containerPort: 5000</w:t>
+        <w:t xml:space="preserve">        - </w:t>
+      </w:r>
+      <w:proofErr w:type="spellStart"/>
+      <w:r>
+        <w:t>containerPort</w:t>
+      </w:r>
+      <w:proofErr w:type="spellEnd"/>
+      <w:r>
+        <w:t>: 5000</w:t>
       </w:r>
     </w:p>
     <w:p>
@@ -1282,13 +1540,22 @@
       </w:r>
     </w:p>
     <w:p>
+      <w:proofErr w:type="spellStart"/>
+      <w:proofErr w:type="gramStart"/>
       <w:r>
         <w:t>service.yaml</w:t>
       </w:r>
-    </w:p>
-    <w:p>
-      <w:r>
-        <w:t>apiVersion: v1</w:t>
+      <w:proofErr w:type="spellEnd"/>
+      <w:proofErr w:type="gramEnd"/>
+    </w:p>
+    <w:p>
+      <w:proofErr w:type="spellStart"/>
+      <w:r>
+        <w:t>apiVersion</w:t>
+      </w:r>
+      <w:proofErr w:type="spellEnd"/>
+      <w:r>
+        <w:t>: v1</w:t>
       </w:r>
       <w:r>
         <w:br/>
@@ -1336,15 +1603,28 @@
       </w:r>
       <w:r>
         <w:br/>
-        <w:t xml:space="preserve">    targetPort: 5000</w:t>
-      </w:r>
-      <w:r>
-        <w:br/>
-      </w:r>
-      <w:r>
-        <w:br/>
-        <w:t xml:space="preserve">  type: NodePort</w:t>
-      </w:r>
+        <w:t xml:space="preserve">    </w:t>
+      </w:r>
+      <w:proofErr w:type="spellStart"/>
+      <w:r>
+        <w:t>targetPort</w:t>
+      </w:r>
+      <w:proofErr w:type="spellEnd"/>
+      <w:r>
+        <w:t>: 5000</w:t>
+      </w:r>
+      <w:r>
+        <w:br/>
+      </w:r>
+      <w:r>
+        <w:br/>
+        <w:t xml:space="preserve">  type: </w:t>
+      </w:r>
+      <w:proofErr w:type="spellStart"/>
+      <w:r>
+        <w:t>NodePort</w:t>
+      </w:r>
+      <w:proofErr w:type="spellEnd"/>
     </w:p>
     <w:p>
       <w:r>
@@ -1369,16 +1649,42 @@
       </w:r>
     </w:p>
     <w:p>
-      <w:r>
-        <w:t>kubectl apply -f deployment.yaml</w:t>
-      </w:r>
-      <w:r>
-        <w:br/>
-      </w:r>
-      <w:r>
-        <w:br/>
-        <w:t>kubectl apply -f service.yaml</w:t>
-      </w:r>
+      <w:proofErr w:type="spellStart"/>
+      <w:r>
+        <w:t>kubectl</w:t>
+      </w:r>
+      <w:proofErr w:type="spellEnd"/>
+      <w:r>
+        <w:t xml:space="preserve"> apply -f </w:t>
+      </w:r>
+      <w:proofErr w:type="spellStart"/>
+      <w:proofErr w:type="gramStart"/>
+      <w:r>
+        <w:t>deployment.yaml</w:t>
+      </w:r>
+      <w:proofErr w:type="spellEnd"/>
+      <w:proofErr w:type="gramEnd"/>
+      <w:r>
+        <w:br/>
+      </w:r>
+      <w:r>
+        <w:br/>
+      </w:r>
+      <w:proofErr w:type="spellStart"/>
+      <w:r>
+        <w:t>kubectl</w:t>
+      </w:r>
+      <w:proofErr w:type="spellEnd"/>
+      <w:r>
+        <w:t xml:space="preserve"> apply -f </w:t>
+      </w:r>
+      <w:proofErr w:type="spellStart"/>
+      <w:proofErr w:type="gramStart"/>
+      <w:r>
+        <w:t>service.yaml</w:t>
+      </w:r>
+      <w:proofErr w:type="spellEnd"/>
+      <w:proofErr w:type="gramEnd"/>
     </w:p>
     <w:p>
       <w:r>
@@ -1386,13 +1692,23 @@
       </w:r>
     </w:p>
     <w:p>
-      <w:r>
-        <w:t>kubectl get pods</w:t>
-      </w:r>
-    </w:p>
-    <w:p>
-      <w:r>
-        <w:t>kubectl get svc</w:t>
+      <w:proofErr w:type="spellStart"/>
+      <w:r>
+        <w:t>kubectl</w:t>
+      </w:r>
+      <w:proofErr w:type="spellEnd"/>
+      <w:r>
+        <w:t xml:space="preserve"> get pods</w:t>
+      </w:r>
+    </w:p>
+    <w:p>
+      <w:proofErr w:type="spellStart"/>
+      <w:r>
+        <w:t>kubectl</w:t>
+      </w:r>
+      <w:proofErr w:type="spellEnd"/>
+      <w:r>
+        <w:t xml:space="preserve"> get svc</w:t>
       </w:r>
     </w:p>
     <w:p>
@@ -1424,7 +1740,15 @@
     </w:p>
     <w:p>
       <w:r>
-        <w:t>flask-cicd-pipeline</w:t>
+        <w:t>flask-</w:t>
+      </w:r>
+      <w:proofErr w:type="spellStart"/>
+      <w:r>
+        <w:t>cicd</w:t>
+      </w:r>
+      <w:proofErr w:type="spellEnd"/>
+      <w:r>
+        <w:t>-pipeline</w:t>
       </w:r>
     </w:p>
     <w:p>
@@ -1439,15 +1763,25 @@
     </w:p>
     <w:p>
       <w:r>
-        <w:t>git init</w:t>
-      </w:r>
-      <w:r>
-        <w:br/>
-      </w:r>
-      <w:r>
-        <w:br/>
-        <w:t>git add .</w:t>
-      </w:r>
+        <w:t xml:space="preserve">git </w:t>
+      </w:r>
+      <w:proofErr w:type="spellStart"/>
+      <w:r>
+        <w:t>init</w:t>
+      </w:r>
+      <w:proofErr w:type="spellEnd"/>
+      <w:r>
+        <w:br/>
+      </w:r>
+      <w:r>
+        <w:br/>
+        <w:t xml:space="preserve">git </w:t>
+      </w:r>
+      <w:proofErr w:type="gramStart"/>
+      <w:r>
+        <w:t>add .</w:t>
+      </w:r>
+      <w:proofErr w:type="gramEnd"/>
       <w:r>
         <w:br/>
       </w:r>
@@ -1534,33 +1868,93 @@
           <w:b/>
           <w:bCs/>
         </w:rPr>
-        <w:t>DOCKER_USERNAME</w:t>
-      </w:r>
-    </w:p>
-    <w:p>
-      <w:r>
-        <w:t>yourdockerhubusername</w:t>
-      </w:r>
-    </w:p>
-    <w:p>
-      <w:pPr>
-        <w:rPr>
-          <w:b/>
-          <w:bCs/>
-        </w:rPr>
-      </w:pPr>
-      <w:r>
-        <w:rPr>
-          <w:b/>
-          <w:bCs/>
-        </w:rPr>
+        <w:t>DOCKER_</w:t>
+      </w:r>
+      <w:proofErr w:type="gramStart"/>
+      <w:r>
+        <w:rPr>
+          <w:b/>
+          <w:bCs/>
+        </w:rPr>
+        <w:t>USERNAME</w:t>
+      </w:r>
+      <w:r>
+        <w:rPr>
+          <w:b/>
+          <w:bCs/>
+        </w:rPr>
+        <w:t xml:space="preserve">  (</w:t>
+      </w:r>
+      <w:proofErr w:type="gramEnd"/>
+      <w:r>
+        <w:rPr>
+          <w:b/>
+          <w:bCs/>
+        </w:rPr>
+        <w:t>rajsingh9479</w:t>
+      </w:r>
+    </w:p>
+    <w:p>
+      <w:pPr>
+        <w:rPr>
+          <w:b/>
+          <w:bCs/>
+        </w:rPr>
+      </w:pPr>
+      <w:r>
+        <w:rPr>
+          <w:b/>
+          <w:bCs/>
+        </w:rPr>
+        <w:t>)</w:t>
+      </w:r>
+    </w:p>
+    <w:p>
+      <w:proofErr w:type="spellStart"/>
+      <w:r>
         <w:lastRenderedPageBreak/>
+        <w:t>Y</w:t>
+      </w:r>
+      <w:r>
+        <w:t>ourdockerhubusername</w:t>
+      </w:r>
+      <w:proofErr w:type="spellEnd"/>
+    </w:p>
+    <w:p>
+      <w:hyperlink r:id="rId10" w:history="1">
+        <w:r>
+          <w:rPr>
+            <w:rStyle w:val="Hyperlink"/>
+          </w:rPr>
+          <w:t>er.rajsingh@gmail.com</w:t>
+        </w:r>
+      </w:hyperlink>
+    </w:p>
+    <w:p/>
+    <w:p/>
+    <w:p>
+      <w:pPr>
+        <w:rPr>
+          <w:b/>
+          <w:bCs/>
+        </w:rPr>
+      </w:pPr>
+      <w:r>
+        <w:rPr>
+          <w:b/>
+          <w:bCs/>
+        </w:rPr>
         <w:t>DOCKER_PASSWORD</w:t>
       </w:r>
     </w:p>
     <w:p>
-      <w:r>
-        <w:t>dockerhub-password-or-token</w:t>
+      <w:proofErr w:type="spellStart"/>
+      <w:r>
+        <w:t>dockerhub</w:t>
+      </w:r>
+      <w:proofErr w:type="spellEnd"/>
+      <w:r>
+        <w:t>-password-or-token</w:t>
       </w:r>
     </w:p>
     <w:p>
@@ -1592,8 +1986,21 @@
     </w:p>
     <w:p>
       <w:r>
-        <w:t>.github/workflows/pipeline.yml</w:t>
-      </w:r>
+        <w:t>.</w:t>
+      </w:r>
+      <w:proofErr w:type="spellStart"/>
+      <w:r>
+        <w:t>github</w:t>
+      </w:r>
+      <w:proofErr w:type="spellEnd"/>
+      <w:r>
+        <w:t>/workflows/</w:t>
+      </w:r>
+      <w:proofErr w:type="spellStart"/>
+      <w:r>
+        <w:t>pipeline.yml</w:t>
+      </w:r>
+      <w:proofErr w:type="spellEnd"/>
     </w:p>
     <w:p>
       <w:r>
@@ -1674,11 +2081,27 @@
       </w:r>
       <w:r>
         <w:br/>
-        <w:t xml:space="preserve">        username: ${{ secrets.DOCKER_USERNAME }}</w:t>
-      </w:r>
-      <w:r>
-        <w:br/>
-        <w:t xml:space="preserve">        password: ${{ secrets.DOCKER_PASSWORD }}</w:t>
+        <w:t xml:space="preserve">        username: ${{ </w:t>
+      </w:r>
+      <w:proofErr w:type="spellStart"/>
+      <w:r>
+        <w:t>secrets.DOCKER_USERNAME</w:t>
+      </w:r>
+      <w:proofErr w:type="spellEnd"/>
+      <w:r>
+        <w:t xml:space="preserve"> }}</w:t>
+      </w:r>
+      <w:r>
+        <w:br/>
+        <w:t xml:space="preserve">        password: ${{ </w:t>
+      </w:r>
+      <w:proofErr w:type="spellStart"/>
+      <w:r>
+        <w:t>secrets.DOCKER_PASSWORD</w:t>
+      </w:r>
+      <w:proofErr w:type="spellEnd"/>
+      <w:r>
+        <w:t xml:space="preserve"> }}</w:t>
       </w:r>
       <w:r>
         <w:br/>
@@ -1693,7 +2116,31 @@
       </w:r>
       <w:r>
         <w:br/>
-        <w:t xml:space="preserve">        docker build -t ${{ secrets.DOCKER_USERNAME }}/flask-cicd:${{ github.sha }} .</w:t>
+        <w:t xml:space="preserve">        docker build -t ${{ </w:t>
+      </w:r>
+      <w:proofErr w:type="spellStart"/>
+      <w:r>
+        <w:t>secrets.DOCKER_USERNAME</w:t>
+      </w:r>
+      <w:proofErr w:type="spellEnd"/>
+      <w:r>
+        <w:t xml:space="preserve"> }}/flask-</w:t>
+      </w:r>
+      <w:proofErr w:type="spellStart"/>
+      <w:r>
+        <w:t>cicd</w:t>
+      </w:r>
+      <w:proofErr w:type="spellEnd"/>
+      <w:r>
+        <w:t xml:space="preserve">:${{ </w:t>
+      </w:r>
+      <w:proofErr w:type="spellStart"/>
+      <w:r>
+        <w:t>github.sha</w:t>
+      </w:r>
+      <w:proofErr w:type="spellEnd"/>
+      <w:r>
+        <w:t xml:space="preserve"> }} .</w:t>
       </w:r>
       <w:r>
         <w:br/>
@@ -1708,7 +2155,31 @@
       </w:r>
       <w:r>
         <w:br/>
-        <w:t xml:space="preserve">        docker push ${{ secrets.DOCKER_USERNAME }}/flask-cicd:${{ github.sha }}</w:t>
+        <w:t xml:space="preserve">        docker push ${{ </w:t>
+      </w:r>
+      <w:proofErr w:type="spellStart"/>
+      <w:r>
+        <w:t>secrets.DOCKER_USERNAME</w:t>
+      </w:r>
+      <w:proofErr w:type="spellEnd"/>
+      <w:r>
+        <w:t xml:space="preserve"> }}/flask-</w:t>
+      </w:r>
+      <w:proofErr w:type="spellStart"/>
+      <w:r>
+        <w:t>cicd</w:t>
+      </w:r>
+      <w:proofErr w:type="spellEnd"/>
+      <w:r>
+        <w:t xml:space="preserve">:${{ </w:t>
+      </w:r>
+      <w:proofErr w:type="spellStart"/>
+      <w:r>
+        <w:t>github.sha</w:t>
+      </w:r>
+      <w:proofErr w:type="spellEnd"/>
+      <w:r>
+        <w:t xml:space="preserve"> }}</w:t>
       </w:r>
     </w:p>
     <w:p>
@@ -1740,12 +2211,18 @@
     </w:p>
     <w:p>
       <w:r>
+        <w:lastRenderedPageBreak/>
         <w:t>Create:</w:t>
       </w:r>
     </w:p>
     <w:p>
-      <w:r>
-        <w:t>kubectl config view --raw</w:t>
+      <w:proofErr w:type="spellStart"/>
+      <w:r>
+        <w:t>kubectl</w:t>
+      </w:r>
+      <w:proofErr w:type="spellEnd"/>
+      <w:r>
+        <w:t xml:space="preserve"> config view --raw</w:t>
       </w:r>
     </w:p>
     <w:p>
@@ -1760,7 +2237,6 @@
     </w:p>
     <w:p>
       <w:r>
-        <w:lastRenderedPageBreak/>
         <w:t>Settings</w:t>
       </w:r>
       <w:r>
@@ -1780,7 +2256,15 @@
     </w:p>
     <w:p>
       <w:r>
-        <w:t>Paste kubeconfig.</w:t>
+        <w:t xml:space="preserve">Paste </w:t>
+      </w:r>
+      <w:proofErr w:type="spellStart"/>
+      <w:r>
+        <w:t>kubeconfig</w:t>
+      </w:r>
+      <w:proofErr w:type="spellEnd"/>
+      <w:r>
+        <w:t>.</w:t>
       </w:r>
     </w:p>
     <w:p>
@@ -1840,8 +2324,13 @@
       </w:r>
       <w:r>
         <w:br/>
-        <w:t xml:space="preserve">  - name: Configure Kubeconfig</w:t>
-      </w:r>
+        <w:t xml:space="preserve">  - name: Configure </w:t>
+      </w:r>
+      <w:proofErr w:type="spellStart"/>
+      <w:r>
+        <w:t>Kubeconfig</w:t>
+      </w:r>
+      <w:proofErr w:type="spellEnd"/>
       <w:r>
         <w:br/>
       </w:r>
@@ -1851,11 +2340,40 @@
       </w:r>
       <w:r>
         <w:br/>
-        <w:t xml:space="preserve">      mkdir -p $HOME/.kube</w:t>
-      </w:r>
-      <w:r>
-        <w:br/>
-        <w:t xml:space="preserve">      echo "${{ secrets.KUBE_CONFIG }}" &gt; $HOME/.kube/config</w:t>
+        <w:t xml:space="preserve">      </w:t>
+      </w:r>
+      <w:proofErr w:type="spellStart"/>
+      <w:r>
+        <w:t>mkdir</w:t>
+      </w:r>
+      <w:proofErr w:type="spellEnd"/>
+      <w:r>
+        <w:t xml:space="preserve"> -p $HOME/.</w:t>
+      </w:r>
+      <w:proofErr w:type="spellStart"/>
+      <w:r>
+        <w:t>kube</w:t>
+      </w:r>
+      <w:proofErr w:type="spellEnd"/>
+      <w:r>
+        <w:br/>
+        <w:t xml:space="preserve">      echo "${{ </w:t>
+      </w:r>
+      <w:proofErr w:type="spellStart"/>
+      <w:r>
+        <w:t>secrets.KUBE_CONFIG</w:t>
+      </w:r>
+      <w:proofErr w:type="spellEnd"/>
+      <w:r>
+        <w:t xml:space="preserve"> }}" &gt; $HOME/.</w:t>
+      </w:r>
+      <w:proofErr w:type="spellStart"/>
+      <w:r>
+        <w:t>kube</w:t>
+      </w:r>
+      <w:proofErr w:type="spellEnd"/>
+      <w:r>
+        <w:t>/config</w:t>
       </w:r>
       <w:r>
         <w:br/>
@@ -1873,11 +2391,43 @@
       </w:r>
       <w:r>
         <w:br/>
-        <w:t xml:space="preserve">      kubectl set image deployment/flask-app \</w:t>
-      </w:r>
-      <w:r>
-        <w:br/>
-        <w:t xml:space="preserve">      flask-app=${{ secrets.DOCKER_USERNAME }}/flask-cicd:${{ github.sha }}</w:t>
+        <w:t xml:space="preserve">      </w:t>
+      </w:r>
+      <w:proofErr w:type="spellStart"/>
+      <w:r>
+        <w:t>kubectl</w:t>
+      </w:r>
+      <w:proofErr w:type="spellEnd"/>
+      <w:r>
+        <w:t xml:space="preserve"> set image deployment/flask-app \</w:t>
+      </w:r>
+      <w:r>
+        <w:br/>
+        <w:t xml:space="preserve">      flask-app=${{ </w:t>
+      </w:r>
+      <w:proofErr w:type="spellStart"/>
+      <w:r>
+        <w:t>secrets.DOCKER_USERNAME</w:t>
+      </w:r>
+      <w:proofErr w:type="spellEnd"/>
+      <w:r>
+        <w:t xml:space="preserve"> }}/flask-</w:t>
+      </w:r>
+      <w:proofErr w:type="spellStart"/>
+      <w:r>
+        <w:t>cicd</w:t>
+      </w:r>
+      <w:proofErr w:type="spellEnd"/>
+      <w:r>
+        <w:t xml:space="preserve">:${{ </w:t>
+      </w:r>
+      <w:proofErr w:type="spellStart"/>
+      <w:r>
+        <w:t>github.sha</w:t>
+      </w:r>
+      <w:proofErr w:type="spellEnd"/>
+      <w:r>
+        <w:t xml:space="preserve"> }}</w:t>
       </w:r>
     </w:p>
     <w:p>
@@ -1944,6 +2494,9 @@
       </w:r>
       <w:r>
         <w:br/>
+      </w:r>
+      <w:r>
+        <w:lastRenderedPageBreak/>
         <w:t xml:space="preserve">     +--&gt; Build Image</w:t>
       </w:r>
       <w:r>
@@ -1968,9 +2521,6 @@
       </w:r>
       <w:r>
         <w:br/>
-      </w:r>
-      <w:r>
-        <w:lastRenderedPageBreak/>
         <w:t xml:space="preserve">     V</w:t>
       </w:r>
       <w:r>
@@ -2041,8 +2591,13 @@
     </w:p>
     <w:p>
       <w:r>
-        <w:t>git add .</w:t>
-      </w:r>
+        <w:t xml:space="preserve">git </w:t>
+      </w:r>
+      <w:proofErr w:type="gramStart"/>
+      <w:r>
+        <w:t>add .</w:t>
+      </w:r>
+      <w:proofErr w:type="gramEnd"/>
       <w:r>
         <w:br/>
       </w:r>
@@ -2086,8 +2641,13 @@
       </w:r>
     </w:p>
     <w:p>
-      <w:r>
-        <w:t>kubectl rollout status deployment/flask-app</w:t>
+      <w:proofErr w:type="spellStart"/>
+      <w:r>
+        <w:t>kubectl</w:t>
+      </w:r>
+      <w:proofErr w:type="spellEnd"/>
+      <w:r>
+        <w:t xml:space="preserve"> rollout status deployment/flask-app</w:t>
       </w:r>
     </w:p>
     <w:p/>
@@ -2975,7 +3535,6 @@
   <w:style w:type="character" w:default="1" w:styleId="DefaultParagraphFont">
     <w:name w:val="Default Paragraph Font"/>
     <w:uiPriority w:val="1"/>
-    <w:semiHidden/>
     <w:unhideWhenUsed/>
   </w:style>
   <w:style w:type="table" w:default="1" w:styleId="TableNormal">

</xml_diff>